<commit_message>
feat(kyc): server-derived 4-tier KYC model + address/ID verification + KYC SOP (#128)
Tier derived server-side from verifications (recomputed each step, never client-set): Tier 0 email+phone; Tier 1 +BVN+NIN; Tier 2 +face+address; Tier 3 +government ID. New /api/kyc/address/ and /api/kyc/id/ endpoints + verifiers; kyc_face recomputes tier; _kyc_state returns tier_name + limits; migration 0010 (schema + data recompute); WhatsApp onboarding -> Tier 0. App KYC screen gains address (Tier 2) + ID (Tier 3) rows. Adds KYC/CDD Operating Procedure SOP and updates the AML tier table. 348 backend tests green; tsc/jest clean.
</commit_message>
<xml_diff>
--- a/compliance/ZITCH_AML_CFT_CPF_POLICY_v1.0.docx
+++ b/compliance/ZITCH_AML_CFT_CPF_POLICY_v1.0.docx
@@ -1701,11 +1701,11 @@
         <w:tblLook w:firstColumn="1" w:firstRow="1" w:lastColumn="0" w:lastRow="0" w:noHBand="0" w:noVBand="1" w:val="04A0"/>
       </w:tblPr>
       <w:tblGrid>
-        <w:gridCol w:w="1800"/>
+        <w:gridCol w:w="1944"/>
         <w:gridCol w:w="3240"/>
-        <w:gridCol w:w="1728"/>
-        <w:gridCol w:w="1728"/>
-        <w:gridCol w:w="1728"/>
+        <w:gridCol w:w="1584"/>
+        <w:gridCol w:w="1584"/>
+        <w:gridCol w:w="1584"/>
       </w:tblGrid>
       <w:tr>
         <w:tc>
@@ -1740,7 +1740,7 @@
                 <w:color w:val="FFFFFF"/>
                 <w:sz w:val="20"/>
               </w:rPr>
-              <w:t>Verification completed</w:t>
+              <w:t>Requirements (cumulative)</w:t>
             </w:r>
           </w:p>
         </w:tc>
@@ -1812,7 +1812,7 @@
                 <w:b w:val="0"/>
                 <w:sz w:val="19"/>
               </w:rPr>
-              <w:t>Tier 1 (basic)</w:t>
+              <w:t>Tier 0 (unverified)</w:t>
             </w:r>
           </w:p>
         </w:tc>
@@ -1828,7 +1828,89 @@
                 <w:b w:val="0"/>
                 <w:sz w:val="19"/>
               </w:rPr>
-              <w:t>Phone + basic details; no verified BVN/NIN</w:t>
+              <w:t>Email + phone (verified at sign-up)</w:t>
+            </w:r>
+          </w:p>
+        </w:tc>
+        <w:tc>
+          <w:tcPr>
+            <w:tcW w:type="dxa" w:w="1930"/>
+          </w:tcPr>
+          <w:p>
+            <w:r/>
+            <w:r>
+              <w:rPr>
+                <w:rFonts w:ascii="Calibri" w:hAnsi="Calibri"/>
+                <w:b w:val="0"/>
+                <w:sz w:val="19"/>
+              </w:rPr>
+              <w:t>₦20,000</w:t>
+            </w:r>
+          </w:p>
+        </w:tc>
+        <w:tc>
+          <w:tcPr>
+            <w:tcW w:type="dxa" w:w="1930"/>
+          </w:tcPr>
+          <w:p>
+            <w:r/>
+            <w:r>
+              <w:rPr>
+                <w:rFonts w:ascii="Calibri" w:hAnsi="Calibri"/>
+                <w:b w:val="0"/>
+                <w:sz w:val="19"/>
+              </w:rPr>
+              <w:t>₦20,000</w:t>
+            </w:r>
+          </w:p>
+        </w:tc>
+        <w:tc>
+          <w:tcPr>
+            <w:tcW w:type="dxa" w:w="1930"/>
+          </w:tcPr>
+          <w:p>
+            <w:r/>
+            <w:r>
+              <w:rPr>
+                <w:rFonts w:ascii="Calibri" w:hAnsi="Calibri"/>
+                <w:b w:val="0"/>
+                <w:sz w:val="19"/>
+              </w:rPr>
+              <w:t>₦10,000</w:t>
+            </w:r>
+          </w:p>
+        </w:tc>
+      </w:tr>
+      <w:tr>
+        <w:tc>
+          <w:tcPr>
+            <w:tcW w:type="dxa" w:w="1930"/>
+          </w:tcPr>
+          <w:p>
+            <w:r/>
+            <w:r>
+              <w:rPr>
+                <w:rFonts w:ascii="Calibri" w:hAnsi="Calibri"/>
+                <w:b w:val="0"/>
+                <w:sz w:val="19"/>
+              </w:rPr>
+              <w:t>Tier 1 (verified)</w:t>
+            </w:r>
+          </w:p>
+        </w:tc>
+        <w:tc>
+          <w:tcPr>
+            <w:tcW w:type="dxa" w:w="1930"/>
+          </w:tcPr>
+          <w:p>
+            <w:r/>
+            <w:r>
+              <w:rPr>
+                <w:rFonts w:ascii="Calibri" w:hAnsi="Calibri"/>
+                <w:b w:val="0"/>
+                <w:sz w:val="19"/>
+              </w:rPr>
+              <w:t>+ BVN AND NIN verified</w:t>
             </w:r>
           </w:p>
         </w:tc>
@@ -1894,7 +1976,7 @@
                 <w:b w:val="0"/>
                 <w:sz w:val="19"/>
               </w:rPr>
-              <w:t>Tier 2 (verified)</w:t>
+              <w:t>Tier 2 (enhanced)</w:t>
             </w:r>
           </w:p>
         </w:tc>
@@ -1910,7 +1992,7 @@
                 <w:b w:val="0"/>
                 <w:sz w:val="19"/>
               </w:rPr>
-              <w:t>One of BVN or NIN verified</w:t>
+              <w:t>+ facial AND residential-address verified</w:t>
             </w:r>
           </w:p>
         </w:tc>
@@ -1976,7 +2058,7 @@
                 <w:b w:val="0"/>
                 <w:sz w:val="19"/>
               </w:rPr>
-              <w:t>Tier 3 (full)</w:t>
+              <w:t>Tier 3 (premium)</w:t>
             </w:r>
           </w:p>
         </w:tc>
@@ -1992,7 +2074,7 @@
                 <w:b w:val="0"/>
                 <w:sz w:val="19"/>
               </w:rPr>
-              <w:t>BVN and NIN verified</w:t>
+              <w:t>+ government-issued ID document verified</w:t>
             </w:r>
           </w:p>
         </w:tc>
@@ -2052,7 +2134,7 @@
         <w:rPr>
           <w:sz w:val="21"/>
         </w:rPr>
-        <w:t>In addition, any transaction at or above ₦100,000 requires durable, server-side facial verification of the customer (a step-up control), independent of tier. These limits and the step-up are enforced by the platform on every money-movement request and are recomputed from the customer’s verified status — a customer cannot self-assert a higher tier or limit.</w:t>
+        <w:t>In addition, any transaction at or above ₦100,000 requires durable, server-side facial verification of the customer — which is itself a Tier 2 requirement — so Tier 0 and Tier 1 customers cannot move ₦100,000 or more in a single transaction. These limits and the step-up are enforced by the platform on every money-movement request and are recomputed on the server from the customer’s verified status — a customer cannot self-assert a higher tier or limit.</w:t>
       </w:r>
     </w:p>
     <w:p>
@@ -2848,17 +2930,16 @@
         <w:tblLook w:firstColumn="1" w:firstRow="1" w:lastColumn="0" w:lastRow="0" w:noHBand="0" w:noVBand="1" w:val="04A0"/>
       </w:tblPr>
       <w:tblGrid>
-        <w:gridCol w:w="1440"/>
-        <w:gridCol w:w="2880"/>
+        <w:gridCol w:w="1296"/>
+        <w:gridCol w:w="3600"/>
         <w:gridCol w:w="1512"/>
         <w:gridCol w:w="1800"/>
-        <w:gridCol w:w="1656"/>
         <w:gridCol w:w="1656"/>
       </w:tblGrid>
       <w:tr>
         <w:tc>
           <w:tcPr>
-            <w:tcW w:type="dxa" w:w="1608"/>
+            <w:tcW w:type="dxa" w:w="1930"/>
             <w:shd w:val="clear" w:color="auto" w:fill="03304C"/>
           </w:tcPr>
           <w:p>
@@ -2876,7 +2957,7 @@
         </w:tc>
         <w:tc>
           <w:tcPr>
-            <w:tcW w:type="dxa" w:w="1608"/>
+            <w:tcW w:type="dxa" w:w="1930"/>
             <w:shd w:val="clear" w:color="auto" w:fill="03304C"/>
           </w:tcPr>
           <w:p>
@@ -2888,13 +2969,13 @@
                 <w:color w:val="FFFFFF"/>
                 <w:sz w:val="20"/>
               </w:rPr>
-              <w:t>Verification</w:t>
+              <w:t>Requirements (cumulative)</w:t>
             </w:r>
           </w:p>
         </w:tc>
         <w:tc>
           <w:tcPr>
-            <w:tcW w:type="dxa" w:w="1608"/>
+            <w:tcW w:type="dxa" w:w="1930"/>
             <w:shd w:val="clear" w:color="auto" w:fill="03304C"/>
           </w:tcPr>
           <w:p>
@@ -2912,7 +2993,7 @@
         </w:tc>
         <w:tc>
           <w:tcPr>
-            <w:tcW w:type="dxa" w:w="1608"/>
+            <w:tcW w:type="dxa" w:w="1930"/>
             <w:shd w:val="clear" w:color="auto" w:fill="03304C"/>
           </w:tcPr>
           <w:p>
@@ -2930,7 +3011,7 @@
         </w:tc>
         <w:tc>
           <w:tcPr>
-            <w:tcW w:type="dxa" w:w="1608"/>
+            <w:tcW w:type="dxa" w:w="1930"/>
             <w:shd w:val="clear" w:color="auto" w:fill="03304C"/>
           </w:tcPr>
           <w:p>
@@ -2946,21 +3027,85 @@
             </w:r>
           </w:p>
         </w:tc>
+      </w:tr>
+      <w:tr>
         <w:tc>
           <w:tcPr>
-            <w:tcW w:type="dxa" w:w="1608"/>
-            <w:shd w:val="clear" w:color="auto" w:fill="03304C"/>
+            <w:tcW w:type="dxa" w:w="1930"/>
           </w:tcPr>
           <w:p>
             <w:r/>
             <w:r>
               <w:rPr>
                 <w:rFonts w:ascii="Calibri" w:hAnsi="Calibri"/>
-                <w:b/>
-                <w:color w:val="FFFFFF"/>
-                <w:sz w:val="20"/>
+                <w:b w:val="0"/>
+                <w:sz w:val="19"/>
               </w:rPr>
-              <w:t>Face step-up</w:t>
+              <w:t>Tier 0</w:t>
+            </w:r>
+          </w:p>
+        </w:tc>
+        <w:tc>
+          <w:tcPr>
+            <w:tcW w:type="dxa" w:w="1930"/>
+          </w:tcPr>
+          <w:p>
+            <w:r/>
+            <w:r>
+              <w:rPr>
+                <w:rFonts w:ascii="Calibri" w:hAnsi="Calibri"/>
+                <w:b w:val="0"/>
+                <w:sz w:val="19"/>
+              </w:rPr>
+              <w:t>Email + phone</w:t>
+            </w:r>
+          </w:p>
+        </w:tc>
+        <w:tc>
+          <w:tcPr>
+            <w:tcW w:type="dxa" w:w="1930"/>
+          </w:tcPr>
+          <w:p>
+            <w:r/>
+            <w:r>
+              <w:rPr>
+                <w:rFonts w:ascii="Calibri" w:hAnsi="Calibri"/>
+                <w:b w:val="0"/>
+                <w:sz w:val="19"/>
+              </w:rPr>
+              <w:t>₦20,000</w:t>
+            </w:r>
+          </w:p>
+        </w:tc>
+        <w:tc>
+          <w:tcPr>
+            <w:tcW w:type="dxa" w:w="1930"/>
+          </w:tcPr>
+          <w:p>
+            <w:r/>
+            <w:r>
+              <w:rPr>
+                <w:rFonts w:ascii="Calibri" w:hAnsi="Calibri"/>
+                <w:b w:val="0"/>
+                <w:sz w:val="19"/>
+              </w:rPr>
+              <w:t>₦20,000</w:t>
+            </w:r>
+          </w:p>
+        </w:tc>
+        <w:tc>
+          <w:tcPr>
+            <w:tcW w:type="dxa" w:w="1930"/>
+          </w:tcPr>
+          <w:p>
+            <w:r/>
+            <w:r>
+              <w:rPr>
+                <w:rFonts w:ascii="Calibri" w:hAnsi="Calibri"/>
+                <w:b w:val="0"/>
+                <w:sz w:val="19"/>
+              </w:rPr>
+              <w:t>₦10,000</w:t>
             </w:r>
           </w:p>
         </w:tc>
@@ -2968,7 +3113,7 @@
       <w:tr>
         <w:tc>
           <w:tcPr>
-            <w:tcW w:type="dxa" w:w="1608"/>
+            <w:tcW w:type="dxa" w:w="1930"/>
           </w:tcPr>
           <w:p>
             <w:r/>
@@ -2984,7 +3129,7 @@
         </w:tc>
         <w:tc>
           <w:tcPr>
-            <w:tcW w:type="dxa" w:w="1608"/>
+            <w:tcW w:type="dxa" w:w="1930"/>
           </w:tcPr>
           <w:p>
             <w:r/>
@@ -2994,13 +3139,13 @@
                 <w:b w:val="0"/>
                 <w:sz w:val="19"/>
               </w:rPr>
-              <w:t>Phone + basic details</w:t>
+              <w:t>+ BVN and NIN</w:t>
             </w:r>
           </w:p>
         </w:tc>
         <w:tc>
           <w:tcPr>
-            <w:tcW w:type="dxa" w:w="1608"/>
+            <w:tcW w:type="dxa" w:w="1930"/>
           </w:tcPr>
           <w:p>
             <w:r/>
@@ -3016,7 +3161,7 @@
         </w:tc>
         <w:tc>
           <w:tcPr>
-            <w:tcW w:type="dxa" w:w="1608"/>
+            <w:tcW w:type="dxa" w:w="1930"/>
           </w:tcPr>
           <w:p>
             <w:r/>
@@ -3032,7 +3177,7 @@
         </w:tc>
         <w:tc>
           <w:tcPr>
-            <w:tcW w:type="dxa" w:w="1608"/>
+            <w:tcW w:type="dxa" w:w="1930"/>
           </w:tcPr>
           <w:p>
             <w:r/>
@@ -3046,27 +3191,11 @@
             </w:r>
           </w:p>
         </w:tc>
-        <w:tc>
-          <w:tcPr>
-            <w:tcW w:type="dxa" w:w="1608"/>
-          </w:tcPr>
-          <w:p>
-            <w:r/>
-            <w:r>
-              <w:rPr>
-                <w:rFonts w:ascii="Calibri" w:hAnsi="Calibri"/>
-                <w:b w:val="0"/>
-                <w:sz w:val="19"/>
-              </w:rPr>
-              <w:t>≥₦100,000</w:t>
-            </w:r>
-          </w:p>
-        </w:tc>
       </w:tr>
       <w:tr>
         <w:tc>
           <w:tcPr>
-            <w:tcW w:type="dxa" w:w="1608"/>
+            <w:tcW w:type="dxa" w:w="1930"/>
           </w:tcPr>
           <w:p>
             <w:r/>
@@ -3082,7 +3211,7 @@
         </w:tc>
         <w:tc>
           <w:tcPr>
-            <w:tcW w:type="dxa" w:w="1608"/>
+            <w:tcW w:type="dxa" w:w="1930"/>
           </w:tcPr>
           <w:p>
             <w:r/>
@@ -3092,13 +3221,13 @@
                 <w:b w:val="0"/>
                 <w:sz w:val="19"/>
               </w:rPr>
-              <w:t>BVN or NIN verified</w:t>
+              <w:t>+ face and address</w:t>
             </w:r>
           </w:p>
         </w:tc>
         <w:tc>
           <w:tcPr>
-            <w:tcW w:type="dxa" w:w="1608"/>
+            <w:tcW w:type="dxa" w:w="1930"/>
           </w:tcPr>
           <w:p>
             <w:r/>
@@ -3114,7 +3243,7 @@
         </w:tc>
         <w:tc>
           <w:tcPr>
-            <w:tcW w:type="dxa" w:w="1608"/>
+            <w:tcW w:type="dxa" w:w="1930"/>
           </w:tcPr>
           <w:p>
             <w:r/>
@@ -3130,7 +3259,7 @@
         </w:tc>
         <w:tc>
           <w:tcPr>
-            <w:tcW w:type="dxa" w:w="1608"/>
+            <w:tcW w:type="dxa" w:w="1930"/>
           </w:tcPr>
           <w:p>
             <w:r/>
@@ -3144,27 +3273,11 @@
             </w:r>
           </w:p>
         </w:tc>
-        <w:tc>
-          <w:tcPr>
-            <w:tcW w:type="dxa" w:w="1608"/>
-          </w:tcPr>
-          <w:p>
-            <w:r/>
-            <w:r>
-              <w:rPr>
-                <w:rFonts w:ascii="Calibri" w:hAnsi="Calibri"/>
-                <w:b w:val="0"/>
-                <w:sz w:val="19"/>
-              </w:rPr>
-              <w:t>≥₦100,000</w:t>
-            </w:r>
-          </w:p>
-        </w:tc>
       </w:tr>
       <w:tr>
         <w:tc>
           <w:tcPr>
-            <w:tcW w:type="dxa" w:w="1608"/>
+            <w:tcW w:type="dxa" w:w="1930"/>
           </w:tcPr>
           <w:p>
             <w:r/>
@@ -3180,7 +3293,7 @@
         </w:tc>
         <w:tc>
           <w:tcPr>
-            <w:tcW w:type="dxa" w:w="1608"/>
+            <w:tcW w:type="dxa" w:w="1930"/>
           </w:tcPr>
           <w:p>
             <w:r/>
@@ -3190,13 +3303,13 @@
                 <w:b w:val="0"/>
                 <w:sz w:val="19"/>
               </w:rPr>
-              <w:t>BVN and NIN verified</w:t>
+              <w:t>+ government ID document</w:t>
             </w:r>
           </w:p>
         </w:tc>
         <w:tc>
           <w:tcPr>
-            <w:tcW w:type="dxa" w:w="1608"/>
+            <w:tcW w:type="dxa" w:w="1930"/>
           </w:tcPr>
           <w:p>
             <w:r/>
@@ -3212,7 +3325,7 @@
         </w:tc>
         <w:tc>
           <w:tcPr>
-            <w:tcW w:type="dxa" w:w="1608"/>
+            <w:tcW w:type="dxa" w:w="1930"/>
           </w:tcPr>
           <w:p>
             <w:r/>
@@ -3228,7 +3341,7 @@
         </w:tc>
         <w:tc>
           <w:tcPr>
-            <w:tcW w:type="dxa" w:w="1608"/>
+            <w:tcW w:type="dxa" w:w="1930"/>
           </w:tcPr>
           <w:p>
             <w:r/>
@@ -3239,22 +3352,6 @@
                 <w:sz w:val="19"/>
               </w:rPr>
               <w:t>₦500,000</w:t>
-            </w:r>
-          </w:p>
-        </w:tc>
-        <w:tc>
-          <w:tcPr>
-            <w:tcW w:type="dxa" w:w="1608"/>
-          </w:tcPr>
-          <w:p>
-            <w:r/>
-            <w:r>
-              <w:rPr>
-                <w:rFonts w:ascii="Calibri" w:hAnsi="Calibri"/>
-                <w:b w:val="0"/>
-                <w:sz w:val="19"/>
-              </w:rPr>
-              <w:t>≥₦100,000</w:t>
             </w:r>
           </w:p>
         </w:tc>

</xml_diff>